<commit_message>
Refine Obrescam automation presentation
</commit_message>
<xml_diff>
--- a/assets/docs/documentacion-automatizaciones-obrescam.docx
+++ b/assets/docs/documentacion-automatizaciones-obrescam.docx
@@ -10,7 +10,7 @@
         <w:rPr>
           <w:b/>
           <w:color w:val="14536A"/>
-          <w:sz w:val="60"/>
+          <w:sz w:val="56"/>
         </w:rPr>
         <w:t>OBRESCAM</w:t>
       </w:r>
@@ -21,24 +21,10 @@
       </w:pPr>
       <w:r>
         <w:rPr>
-          <w:b/>
-          <w:color w:val="1C2938"/>
-          <w:sz w:val="38"/>
-        </w:rPr>
-        <w:t>Automatizaciones administrativas y documentales</w:t>
-      </w:r>
-    </w:p>
-    <w:p>
-      <w:pPr>
-        <w:jc w:val="center"/>
-      </w:pPr>
-      <w:r>
-        <w:rPr>
-          <w:b w:val="0"/>
-          <w:color w:val="666666"/>
+          <w:color w:val="505050"/>
           <w:sz w:val="24"/>
         </w:rPr>
-        <w:t>Dossier de proyectos realizados durante practicas</w:t>
+        <w:t>Obras Especiales Castilla La Mancha S.L.U.</w:t>
       </w:r>
     </w:p>
     <w:p>
@@ -50,9 +36,9 @@
         <w:rPr>
           <w:b/>
           <w:color w:val="14536A"/>
-          <w:sz w:val="22"/>
+          <w:sz w:val="36"/>
         </w:rPr>
-        <w:t>Fernando Delgado Izquierdo | Administracion digital, Python y mejora de procesos</w:t>
+        <w:t>Documentaci?n t?cnica de automatizaciones internas</w:t>
       </w:r>
     </w:p>
     <w:p>
@@ -61,27 +47,33 @@
       </w:pPr>
       <w:r>
         <w:rPr>
-          <w:b w:val="0"/>
-          <w:color w:val="777777"/>
-          <w:sz w:val="20"/>
+          <w:b/>
         </w:rPr>
-        <w:t>Fecha: 29/05/2026</w:t>
+        <w:t>Radar Obrescam de Licitaciones</w:t>
+        <w:br/>
+      </w:r>
+      <w:r>
+        <w:rPr>
+          <w:b/>
+        </w:rPr>
+        <w:t>EPI AutoDoc RRHH</w:t>
+        <w:br/>
+      </w:r>
+      <w:r>
+        <w:t>Python ? Playwright ? python-docx ? Codex</w:t>
       </w:r>
     </w:p>
     <w:p>
       <w:pPr>
-        <w:shd w:fill="F8FBFB"/>
+        <w:jc w:val="center"/>
       </w:pPr>
       <w:r>
-        <w:rPr>
-          <w:b/>
-          <w:color w:val="10535F"/>
-        </w:rPr>
-        <w:t>Resumen ejecutivo</w:t>
-        <w:br/>
+        <w:t>Versi?n 2.0 ? Mayo 2026</w:t>
       </w:r>
+    </w:p>
+    <w:p>
       <w:r>
-        <w:t>Durante las practicas en Obrescam se han desarrollado herramientas locales para reducir tareas repetitivas de administracion: una automatizacion para localizar y descargar documentacion de licitaciones publicas, y otra para generar documentos de entrega de EPIs para nuevos trabajadores a partir de una plantilla corporativa.</w:t>
+        <w:br w:type="page"/>
       </w:r>
     </w:p>
     <w:p>
@@ -89,23 +81,142 @@
         <w:pStyle w:val="Heading1"/>
       </w:pPr>
       <w:r>
-        <w:t>Radar Obrescam de Licitaciones</w:t>
+        <w:t>1. Descripci?n general</w:t>
       </w:r>
     </w:p>
     <w:p>
+      <w:r>
+        <w:t>Este documento recoge dos automatizaciones diferentes realizadas durante las pr?cticas en Obrescam. Ambas nacen de necesidades reales de oficina, pero pertenecen a ?reas distintas: licitaciones y recursos humanos.</w:t>
+      </w:r>
+    </w:p>
+    <w:tbl>
+      <w:tblPr>
+        <w:tblStyle w:val="TableGrid"/>
+        <w:tblW w:type="auto" w:w="0"/>
+        <w:tblLook w:firstColumn="1" w:firstRow="1" w:lastColumn="0" w:lastRow="0" w:noHBand="0" w:noVBand="1" w:val="04A0"/>
+      </w:tblPr>
+      <w:tblGrid>
+        <w:gridCol w:w="3360"/>
+        <w:gridCol w:w="3360"/>
+        <w:gridCol w:w="3360"/>
+      </w:tblGrid>
+      <w:tr>
+        <w:tc>
+          <w:tcPr>
+            <w:tcW w:type="dxa" w:w="3360"/>
+          </w:tcPr>
+          <w:p>
+            <w:r>
+              <w:rPr>
+                <w:b/>
+              </w:rPr>
+              <w:t>Proyecto</w:t>
+            </w:r>
+          </w:p>
+        </w:tc>
+        <w:tc>
+          <w:tcPr>
+            <w:tcW w:type="dxa" w:w="3360"/>
+          </w:tcPr>
+          <w:p>
+            <w:r>
+              <w:rPr>
+                <w:b/>
+              </w:rPr>
+              <w:t>?rea</w:t>
+            </w:r>
+          </w:p>
+        </w:tc>
+        <w:tc>
+          <w:tcPr>
+            <w:tcW w:type="dxa" w:w="3360"/>
+          </w:tcPr>
+          <w:p>
+            <w:r>
+              <w:rPr>
+                <w:b/>
+              </w:rPr>
+              <w:t>Objetivo</w:t>
+            </w:r>
+          </w:p>
+        </w:tc>
+      </w:tr>
+      <w:tr>
+        <w:tc>
+          <w:tcPr>
+            <w:tcW w:type="dxa" w:w="3360"/>
+          </w:tcPr>
+          <w:p>
+            <w:r>
+              <w:t>Radar Obrescam de Licitaciones</w:t>
+            </w:r>
+          </w:p>
+        </w:tc>
+        <w:tc>
+          <w:tcPr>
+            <w:tcW w:type="dxa" w:w="3360"/>
+          </w:tcPr>
+          <w:p>
+            <w:r>
+              <w:t>Licitaciones / Desarrollo interno</w:t>
+            </w:r>
+          </w:p>
+        </w:tc>
+        <w:tc>
+          <w:tcPr>
+            <w:tcW w:type="dxa" w:w="3360"/>
+          </w:tcPr>
+          <w:p>
+            <w:r>
+              <w:t>Automatizar la b?squeda, clasificaci?n y descarga documental de expedientes de obras.</w:t>
+            </w:r>
+          </w:p>
+        </w:tc>
+      </w:tr>
+      <w:tr>
+        <w:tc>
+          <w:tcPr>
+            <w:tcW w:type="dxa" w:w="3360"/>
+          </w:tcPr>
+          <w:p>
+            <w:r>
+              <w:t>EPI AutoDoc RRHH</w:t>
+            </w:r>
+          </w:p>
+        </w:tc>
+        <w:tc>
+          <w:tcPr>
+            <w:tcW w:type="dxa" w:w="3360"/>
+          </w:tcPr>
+          <w:p>
+            <w:r>
+              <w:t>Recursos Humanos / Administraci?n</w:t>
+            </w:r>
+          </w:p>
+        </w:tc>
+        <w:tc>
+          <w:tcPr>
+            <w:tcW w:type="dxa" w:w="3360"/>
+          </w:tcPr>
+          <w:p>
+            <w:r>
+              <w:t>Generar documentos de entrega de EPIs desde una plantilla Word corporativa.</w:t>
+            </w:r>
+          </w:p>
+        </w:tc>
+      </w:tr>
+    </w:tbl>
+    <w:p>
       <w:pPr>
-        <w:shd w:fill="EEF7F7"/>
+        <w:pStyle w:val="Heading1"/>
       </w:pPr>
       <w:r>
-        <w:rPr>
-          <w:b/>
-          <w:color w:val="10535F"/>
-        </w:rPr>
-        <w:t>Automatizacion del estudio documental de licitaciones publicas de obras.</w:t>
-        <w:br/>
+        <w:t>2. Radar Obrescam de Licitaciones</w:t>
       </w:r>
+    </w:p>
+    <w:p>
       <w:r>
-        <w:t>El sistema consulta la Plataforma de Contratacion del Sector Publico, filtra obras publicadas en Cuenca, genera una cola de expedientes con URLs directas y descarga la documentacion asociada en carpetas trazables.</w:t>
+        <w:t>Proyecto orientado a automatizar la primera fase del estudio de licitaciones p?blicas de obras. El sistema consulta la Plataforma de Contrataci?n del Sector P?blico, aplica filtros de Cuenca, crea una cola de expedientes y descarga la documentaci?n asociada.</w:t>
       </w:r>
     </w:p>
     <w:p>
@@ -113,20 +224,7 @@
         <w:pStyle w:val="Heading2"/>
       </w:pPr>
       <w:r>
-        <w:t>Problema resuelto</w:t>
-      </w:r>
-    </w:p>
-    <w:p>
-      <w:r>
-        <w:t>La revision manual de licitaciones requiere entrar en la plataforma, aplicar filtros, revisar expedientes y descargar pliegos. El proceso se vuelve lento cuando la web pierde filtros al volver de un expediente.</w:t>
-      </w:r>
-    </w:p>
-    <w:p>
-      <w:pPr>
-        <w:pStyle w:val="Heading2"/>
-      </w:pPr>
-      <w:r>
-        <w:t>Funciones principales</w:t>
+        <w:t>2.1 Funciones principales</w:t>
       </w:r>
     </w:p>
     <w:p>
@@ -134,7 +232,7 @@
         <w:pStyle w:val="ListBullet"/>
       </w:pPr>
       <w:r>
-        <w:t>Busqueda automatizada con filtros: Espana, Obras, Publicada y ES423 Cuenca.</w:t>
+        <w:t>Aplicaci?n de filtros: Espa?a, Obras, Publicada y ES423 Cuenca.</w:t>
       </w:r>
     </w:p>
     <w:p>
@@ -142,7 +240,7 @@
         <w:pStyle w:val="ListBullet"/>
       </w:pPr>
       <w:r>
-        <w:t>Creacion de tabla madre y cola estable de expedientes.</w:t>
+        <w:t>Extracci?n de tabla madre y generaci?n de cola con URLs directas.</w:t>
       </w:r>
     </w:p>
     <w:p>
@@ -150,7 +248,7 @@
         <w:pStyle w:val="ListBullet"/>
       </w:pPr>
       <w:r>
-        <w:t>Comparacion contra carpetas locales para detectar nuevos o actualizados.</w:t>
+        <w:t>Comparaci?n contra carpetas locales para detectar expedientes nuevos o actualizados.</w:t>
       </w:r>
     </w:p>
     <w:p>
@@ -166,7 +264,7 @@
         <w:pStyle w:val="ListBullet"/>
       </w:pPr>
       <w:r>
-        <w:t>Resumen local con descargados, actualizados, saltados e incidencias.</w:t>
+        <w:t>Evita repetir filtros entre expedientes usando URLs directas.</w:t>
       </w:r>
     </w:p>
     <w:p>
@@ -174,12 +272,12 @@
         <w:pStyle w:val="Heading2"/>
       </w:pPr>
       <w:r>
-        <w:t>Tecnologias y competencias</w:t>
+        <w:t>2.2 Papel de Codex</w:t>
       </w:r>
     </w:p>
     <w:p>
       <w:r>
-        <w:t>Python, Playwright, Requests, BeautifulSoup, JSON, PowerShell, automatizacion web, gestion documental.</w:t>
+        <w:t>Codex se utiliz? como apoyo t?cnico para dise?ar y depurar el flujo, preparar instrucciones operativas, corregir problemas del entorno local, separar la descarga documental de la extracci?n del MYP y documentar el sistema. La idea es dejar la parte mec?nica estable en Python y reservar Codex/IA para la siguiente fase: an?lisis documental y validaci?n de mediciones y presupuestos.</w:t>
       </w:r>
     </w:p>
     <w:p>
@@ -187,26 +285,12 @@
         <w:pStyle w:val="Heading2"/>
       </w:pPr>
       <w:r>
-        <w:t>Estructura de salida del Radar</w:t>
+        <w:t>2.3 Tecnolog?as</w:t>
       </w:r>
     </w:p>
     <w:p>
       <w:r>
-        <w:rPr>
-          <w:rFonts w:ascii="Consolas" w:hAnsi="Consolas"/>
-          <w:sz w:val="19"/>
-        </w:rPr>
-        <w:t>PLATAFORMA/</w:t>
-        <w:br/>
-        <w:t xml:space="preserve">  Expediente/</w:t>
-        <w:br/>
-        <w:t xml:space="preserve">    detail.html</w:t>
-        <w:br/>
-        <w:t xml:space="preserve">    metadata.json</w:t>
-        <w:br/>
-        <w:t xml:space="preserve">    Pliego/</w:t>
-        <w:br/>
-        <w:t xml:space="preserve">      documentos descargados</w:t>
+        <w:t>Python, Playwright, Requests, BeautifulSoup, JSON, PowerShell, Codex, automatizaci?n web y gesti?n documental.</w:t>
       </w:r>
     </w:p>
     <w:p>
@@ -214,23 +298,12 @@
         <w:pStyle w:val="Heading1"/>
       </w:pPr>
       <w:r>
-        <w:t>EPI AutoDoc RRHH</w:t>
+        <w:t>3. EPI AutoDoc RRHH</w:t>
       </w:r>
     </w:p>
     <w:p>
-      <w:pPr>
-        <w:shd w:fill="EEF7F7"/>
-      </w:pPr>
       <w:r>
-        <w:rPr>
-          <w:b/>
-          <w:color w:val="10535F"/>
-        </w:rPr>
-        <w:t>Generador automatico de documentos de entrega de EPIs para nuevos trabajadores.</w:t>
-        <w:br/>
-      </w:r>
-      <w:r>
-        <w:t>La herramienta pide nombre, DNI/NIE, puesto y fecha de firma; abre la plantilla MODELO.docx, sustituye los marcadores, guarda el documento con nombre normalizado y lo manda a imprimir.</w:t>
+        <w:t>Automatizaci?n independiente para Recursos Humanos. El script genera documentos de entrega de EPIs para nuevos trabajadores a partir de una plantilla Word.</w:t>
       </w:r>
     </w:p>
     <w:p>
@@ -238,12 +311,47 @@
         <w:pStyle w:val="Heading2"/>
       </w:pPr>
       <w:r>
-        <w:t>Problema resuelto</w:t>
+        <w:t>3.1 Funcionamiento</w:t>
       </w:r>
     </w:p>
     <w:p>
+      <w:pPr>
+        <w:pStyle w:val="ListBullet"/>
+      </w:pPr>
       <w:r>
-        <w:t>La creacion manual de documentos de entrega de EPIs obliga a copiar datos del trabajador en una plantilla, revisar fechas y preparar el documento para impresion.</w:t>
+        <w:t>Pide por consola nombre y apellidos, DNI/NIE, puesto y fecha de firma.</w:t>
+      </w:r>
+    </w:p>
+    <w:p>
+      <w:pPr>
+        <w:pStyle w:val="ListBullet"/>
+      </w:pPr>
+      <w:r>
+        <w:t>Valida que los campos obligatorios no est?n vac?os.</w:t>
+      </w:r>
+    </w:p>
+    <w:p>
+      <w:pPr>
+        <w:pStyle w:val="ListBullet"/>
+      </w:pPr>
+      <w:r>
+        <w:t>Valida la fecha en formato DD/MM/AAAA.</w:t>
+      </w:r>
+    </w:p>
+    <w:p>
+      <w:pPr>
+        <w:pStyle w:val="ListBullet"/>
+      </w:pPr>
+      <w:r>
+        <w:t>Sustituye marcadores en p?rrafos, tablas, encabezados y pies del documento Word.</w:t>
+      </w:r>
+    </w:p>
+    <w:p>
+      <w:pPr>
+        <w:pStyle w:val="ListBullet"/>
+      </w:pPr>
+      <w:r>
+        <w:t>Guarda el documento final con nombre normalizado y lo env?a a impresi?n.</w:t>
       </w:r>
     </w:p>
     <w:p>
@@ -251,47 +359,125 @@
         <w:pStyle w:val="Heading2"/>
       </w:pPr>
       <w:r>
-        <w:t>Funciones principales</w:t>
+        <w:t>3.2 Archivos del sistema</w:t>
+      </w:r>
+    </w:p>
+    <w:tbl>
+      <w:tblPr>
+        <w:tblStyle w:val="TableGrid"/>
+        <w:tblW w:type="auto" w:w="0"/>
+        <w:tblLook w:firstColumn="1" w:firstRow="1" w:lastColumn="0" w:lastRow="0" w:noHBand="0" w:noVBand="1" w:val="04A0"/>
+      </w:tblPr>
+      <w:tblGrid>
+        <w:gridCol w:w="5040"/>
+        <w:gridCol w:w="5040"/>
+      </w:tblGrid>
+      <w:tr>
+        <w:tc>
+          <w:tcPr>
+            <w:tcW w:type="dxa" w:w="5040"/>
+          </w:tcPr>
+          <w:p>
+            <w:r>
+              <w:rPr>
+                <w:b/>
+              </w:rPr>
+              <w:t>Archivo</w:t>
+            </w:r>
+          </w:p>
+        </w:tc>
+        <w:tc>
+          <w:tcPr>
+            <w:tcW w:type="dxa" w:w="5040"/>
+          </w:tcPr>
+          <w:p>
+            <w:r>
+              <w:rPr>
+                <w:b/>
+              </w:rPr>
+              <w:t>Funci?n</w:t>
+            </w:r>
+          </w:p>
+        </w:tc>
+      </w:tr>
+      <w:tr>
+        <w:tc>
+          <w:tcPr>
+            <w:tcW w:type="dxa" w:w="5040"/>
+          </w:tcPr>
+          <w:p>
+            <w:r>
+              <w:t>rellenar_epi.py</w:t>
+            </w:r>
+          </w:p>
+        </w:tc>
+        <w:tc>
+          <w:tcPr>
+            <w:tcW w:type="dxa" w:w="5040"/>
+          </w:tcPr>
+          <w:p>
+            <w:r>
+              <w:t>Script principal de generaci?n documental.</w:t>
+            </w:r>
+          </w:p>
+        </w:tc>
+      </w:tr>
+      <w:tr>
+        <w:tc>
+          <w:tcPr>
+            <w:tcW w:type="dxa" w:w="5040"/>
+          </w:tcPr>
+          <w:p>
+            <w:r>
+              <w:t>MODELO.docx</w:t>
+            </w:r>
+          </w:p>
+        </w:tc>
+        <w:tc>
+          <w:tcPr>
+            <w:tcW w:type="dxa" w:w="5040"/>
+          </w:tcPr>
+          <w:p>
+            <w:r>
+              <w:t>Plantilla Word corporativa con marcadores.</w:t>
+            </w:r>
+          </w:p>
+        </w:tc>
+      </w:tr>
+      <w:tr>
+        <w:tc>
+          <w:tcPr>
+            <w:tcW w:type="dxa" w:w="5040"/>
+          </w:tcPr>
+          <w:p>
+            <w:r>
+              <w:t>Documentacion_Juego_Trabajadores.pdf</w:t>
+            </w:r>
+          </w:p>
+        </w:tc>
+        <w:tc>
+          <w:tcPr>
+            <w:tcW w:type="dxa" w:w="5040"/>
+          </w:tcPr>
+          <w:p>
+            <w:r>
+              <w:t>Manual original de uso y configuraci?n.</w:t>
+            </w:r>
+          </w:p>
+        </w:tc>
+      </w:tr>
+    </w:tbl>
+    <w:p>
+      <w:pPr>
+        <w:pStyle w:val="Heading1"/>
+      </w:pPr>
+      <w:r>
+        <w:t>4. Encaje en el CV</w:t>
       </w:r>
     </w:p>
     <w:p>
-      <w:pPr>
-        <w:pStyle w:val="ListBullet"/>
-      </w:pPr>
       <w:r>
-        <w:t>Entrada guiada por consola con validacion de campos obligatorios.</w:t>
-      </w:r>
-    </w:p>
-    <w:p>
-      <w:pPr>
-        <w:pStyle w:val="ListBullet"/>
-      </w:pPr>
-      <w:r>
-        <w:t>Validacion de fecha en formato DD/MM/AAAA.</w:t>
-      </w:r>
-    </w:p>
-    <w:p>
-      <w:pPr>
-        <w:pStyle w:val="ListBullet"/>
-      </w:pPr>
-      <w:r>
-        <w:t>Sustitucion de marcadores en parrafos, tablas, encabezados y pies.</w:t>
-      </w:r>
-    </w:p>
-    <w:p>
-      <w:pPr>
-        <w:pStyle w:val="ListBullet"/>
-      </w:pPr>
-      <w:r>
-        <w:t>Generacion automatica del archivo EPI_NOMBRE_FECHA.docx.</w:t>
-      </w:r>
-    </w:p>
-    <w:p>
-      <w:pPr>
-        <w:pStyle w:val="ListBullet"/>
-      </w:pPr>
-      <w:r>
-        <w:t>Envio directo a impresora desde Windows.</w:t>
+        <w:t>Estos proyectos se presentan principalmente en la secci?n de Desarrollo porque implican programaci?n, automatizaci?n web, generaci?n documental y uso de Codex. En Administraci?n se mencionan como aplicaci?n pr?ctica dentro de Obrescam, ya que el objetivo final es mejorar procesos reales de oficina.</w:t>
       </w:r>
     </w:p>
     <w:p>
@@ -299,20 +485,7 @@
         <w:pStyle w:val="Heading2"/>
       </w:pPr>
       <w:r>
-        <w:t>Tecnologias y competencias</w:t>
-      </w:r>
-    </w:p>
-    <w:p>
-      <w:r>
-        <w:t>Python, python-docx, Word, PowerShell, automatizacion documental, RRHH, plantillas corporativas.</w:t>
-      </w:r>
-    </w:p>
-    <w:p>
-      <w:pPr>
-        <w:pStyle w:val="Heading1"/>
-      </w:pPr>
-      <w:r>
-        <w:t>Texto listo para CV</w:t>
+        <w:t>4.1 Texto recomendado para Desarrollo</w:t>
       </w:r>
     </w:p>
     <w:p>
@@ -323,10 +496,32 @@
         <w:rPr>
           <w:b/>
         </w:rPr>
-        <w:t xml:space="preserve">Automatizacion administrativa en Obrescam: </w:t>
+        <w:t xml:space="preserve">Automatizaciones internas en Obrescam: </w:t>
       </w:r>
       <w:r>
-        <w:t>desarrollo de herramientas locales en Python para reducir tareas repetitivas de oficina: monitorizacion y descarga documental de licitaciones publicas, y generacion automatica de documentos de entrega de EPIs para nuevos trabajadores a partir de plantillas corporativas.</w:t>
+        <w:t>desarrollo de herramientas en Python para procesos reales de empresa, incluyendo un sistema de b?squeda y descarga documental de licitaciones p?blicas y un generador de documentos EPI para RRHH. Uso de Codex como apoyo para dise?ar flujos, depurar el entorno local, documentar instrucciones y preparar la fase de an?lisis documental con IA.</w:t>
+      </w:r>
+    </w:p>
+    <w:p>
+      <w:pPr>
+        <w:pStyle w:val="Heading2"/>
+      </w:pPr>
+      <w:r>
+        <w:t>4.2 Texto recomendado para Administraci?n</w:t>
+      </w:r>
+    </w:p>
+    <w:p>
+      <w:pPr>
+        <w:shd w:fill="EEF7F7"/>
+      </w:pPr>
+      <w:r>
+        <w:rPr>
+          <w:b/>
+        </w:rPr>
+        <w:t xml:space="preserve">Pr?cticas en Obrescam: </w:t>
+      </w:r>
+      <w:r>
+        <w:t>apoyo administrativo y mejora de procesos internos mediante herramientas propias para organizaci?n documental, licitaciones y documentaci?n de nuevos trabajadores.</w:t>
       </w:r>
     </w:p>
     <w:p>
@@ -334,118 +529,60 @@
         <w:pStyle w:val="Heading1"/>
       </w:pPr>
       <w:r>
-        <w:t>Encaje profesional</w:t>
-      </w:r>
-    </w:p>
-    <w:p>
-      <w:pPr>
-        <w:pStyle w:val="ListBullet"/>
-      </w:pPr>
-      <w:r>
-        <w:t>Administracion digital aplicada a procesos reales de empresa.</w:t>
-      </w:r>
-    </w:p>
-    <w:p>
-      <w:pPr>
-        <w:pStyle w:val="ListBullet"/>
-      </w:pPr>
-      <w:r>
-        <w:t>Capacidad para transformar tareas repetitivas en herramientas ejecutables.</w:t>
-      </w:r>
-    </w:p>
-    <w:p>
-      <w:pPr>
-        <w:pStyle w:val="ListBullet"/>
-      </w:pPr>
-      <w:r>
-        <w:t>Organizacion documental, trazabilidad y cuidado de datos sensibles.</w:t>
-      </w:r>
-    </w:p>
-    <w:p>
-      <w:pPr>
-        <w:pStyle w:val="ListBullet"/>
-      </w:pPr>
-      <w:r>
-        <w:t>Perfil mixto: base administrativa, programacion practica y soporte a usuarios internos.</w:t>
-      </w:r>
-    </w:p>
-    <w:p>
-      <w:pPr>
-        <w:pStyle w:val="Heading1"/>
-      </w:pPr>
-      <w:r>
-        <w:t>Archivos incluidos</w:t>
-      </w:r>
-    </w:p>
-    <w:p>
-      <w:pPr>
-        <w:pStyle w:val="ListBullet"/>
-      </w:pPr>
-      <w:r>
-        <w:t>codigo_fuente/licitaciones/process_cuenca_queue.py</w:t>
-      </w:r>
-    </w:p>
-    <w:p>
-      <w:pPr>
-        <w:pStyle w:val="ListBullet"/>
-      </w:pPr>
-      <w:r>
-        <w:t>codigo_fuente/licitaciones/requirements_runtime.txt</w:t>
-      </w:r>
-    </w:p>
-    <w:p>
-      <w:pPr>
-        <w:pStyle w:val="ListBullet"/>
-      </w:pPr>
-      <w:r>
-        <w:t>codigo_fuente/rrhh_epi/rellenar_epi.py</w:t>
-      </w:r>
-    </w:p>
-    <w:p>
-      <w:pPr>
-        <w:pStyle w:val="ListBullet"/>
-      </w:pPr>
-      <w:r>
-        <w:t>codigo_fuente/rrhh_epi/MODELO.docx</w:t>
-      </w:r>
-    </w:p>
-    <w:p>
-      <w:pPr>
-        <w:pStyle w:val="ListBullet"/>
-      </w:pPr>
-      <w:r>
-        <w:t>documentacion_tecnica/README_BUSQUEDA_WEB_EFICIENTE.md</w:t>
-      </w:r>
-    </w:p>
-    <w:p>
-      <w:pPr>
-        <w:pStyle w:val="ListBullet"/>
-      </w:pPr>
-      <w:r>
-        <w:t>documentacion_tecnica/codex_automation_prompt_v2.md</w:t>
-      </w:r>
-    </w:p>
-    <w:p>
-      <w:pPr>
-        <w:pStyle w:val="Heading1"/>
-      </w:pPr>
-      <w:r>
-        <w:t>Nota de privacidad</w:t>
+        <w:t>5. Nota de privacidad</w:t>
       </w:r>
     </w:p>
     <w:p>
       <w:r>
-        <w:t>El paquete no incluye documentos generados con nombres reales de trabajadores. Solo se conserva el script y la plantilla necesarios para demostrar el funcionamiento de la automatizacion.</w:t>
+        <w:t>Para proteger datos personales, el paquete de documentaci?n no incluye documentos generados con nombres reales de trabajadores. Solo se conservan el script, la plantilla y la documentaci?n necesaria para explicar el funcionamiento.</w:t>
       </w:r>
     </w:p>
     <w:sectPr>
+      <w:headerReference w:type="default" r:id="rId9"/>
+      <w:footerReference w:type="default" r:id="rId10"/>
       <w:pgSz w:w="12240" w:h="15840"/>
-      <w:pgMar w:top="792" w:right="936" w:bottom="792" w:left="936" w:header="720" w:footer="720" w:gutter="0"/>
+      <w:pgMar w:top="936" w:right="1080" w:bottom="936" w:left="1080" w:header="720" w:footer="720" w:gutter="0"/>
       <w:cols w:space="720"/>
       <w:docGrid w:linePitch="360"/>
     </w:sectPr>
   </w:body>
 </w:document>
+</file>
+
+<file path=word/footer1.xml><?xml version="1.0" encoding="utf-8"?>
+<w:ftr xmlns:m="http://schemas.openxmlformats.org/officeDocument/2006/math" xmlns:mc="http://schemas.openxmlformats.org/markup-compatibility/2006" xmlns:mo="http://schemas.microsoft.com/office/mac/office/2008/main" xmlns:mv="urn:schemas-microsoft-com:mac:vml" xmlns:o="urn:schemas-microsoft-com:office:office" xmlns:r="http://schemas.openxmlformats.org/officeDocument/2006/relationships" xmlns:v="urn:schemas-microsoft-com:vml" xmlns:w10="urn:schemas-microsoft-com:office:word" xmlns:w14="http://schemas.microsoft.com/office/word/2010/wordml" xmlns:w="http://schemas.openxmlformats.org/wordprocessingml/2006/main" xmlns:wne="http://schemas.microsoft.com/office/word/2006/wordml" xmlns:wp14="http://schemas.microsoft.com/office/word/2010/wordprocessingDrawing" xmlns:wp="http://schemas.openxmlformats.org/drawingml/2006/wordprocessingDrawing" xmlns:wpc="http://schemas.microsoft.com/office/word/2010/wordprocessingCanvas" xmlns:wpg="http://schemas.microsoft.com/office/word/2010/wordprocessingGroup" xmlns:wpi="http://schemas.microsoft.com/office/word/2010/wordprocessingInk" xmlns:wps="http://schemas.microsoft.com/office/word/2010/wordprocessingShape" mc:Ignorable="w14 wp14">
+  <w:p>
+    <w:pPr>
+      <w:pStyle w:val="Footer"/>
+      <w:jc w:val="center"/>
+    </w:pPr>
+    <w:r>
+      <w:rPr>
+        <w:color w:val="5A5A5A"/>
+        <w:sz w:val="18"/>
+      </w:rPr>
+      <w:t>Fernando Delgado Izquierdo ? Pr?cticas en Obrescam ? Mayo 2026</w:t>
+    </w:r>
+  </w:p>
+</w:ftr>
+</file>
+
+<file path=word/header1.xml><?xml version="1.0" encoding="utf-8"?>
+<w:hdr xmlns:m="http://schemas.openxmlformats.org/officeDocument/2006/math" xmlns:mc="http://schemas.openxmlformats.org/markup-compatibility/2006" xmlns:mo="http://schemas.microsoft.com/office/mac/office/2008/main" xmlns:mv="urn:schemas-microsoft-com:mac:vml" xmlns:o="urn:schemas-microsoft-com:office:office" xmlns:r="http://schemas.openxmlformats.org/officeDocument/2006/relationships" xmlns:v="urn:schemas-microsoft-com:vml" xmlns:w10="urn:schemas-microsoft-com:office:word" xmlns:w14="http://schemas.microsoft.com/office/word/2010/wordml" xmlns:w="http://schemas.openxmlformats.org/wordprocessingml/2006/main" xmlns:wne="http://schemas.microsoft.com/office/word/2006/wordml" xmlns:wp14="http://schemas.microsoft.com/office/word/2010/wordprocessingDrawing" xmlns:wp="http://schemas.openxmlformats.org/drawingml/2006/wordprocessingDrawing" xmlns:wpc="http://schemas.microsoft.com/office/word/2010/wordprocessingCanvas" xmlns:wpg="http://schemas.microsoft.com/office/word/2010/wordprocessingGroup" xmlns:wpi="http://schemas.microsoft.com/office/word/2010/wordprocessingInk" xmlns:wps="http://schemas.microsoft.com/office/word/2010/wordprocessingShape" mc:Ignorable="w14 wp14">
+  <w:p>
+    <w:pPr>
+      <w:pStyle w:val="Header"/>
+      <w:jc w:val="center"/>
+    </w:pPr>
+    <w:r>
+      <w:rPr>
+        <w:color w:val="5A5A5A"/>
+        <w:sz w:val="18"/>
+      </w:rPr>
+      <w:t>OBRESCAM ? Automatizaciones internas con Python y Codex</w:t>
+    </w:r>
+  </w:p>
+</w:hdr>
 </file>
 
 <file path=word/numbering.xml><?xml version="1.0" encoding="utf-8"?>
@@ -1164,11 +1301,11 @@
       <w:contextualSpacing/>
     </w:pPr>
     <w:rPr>
-      <w:rFonts w:asciiTheme="majorHAnsi" w:eastAsiaTheme="majorEastAsia" w:hAnsiTheme="majorHAnsi" w:cstheme="majorBidi" w:ascii="Calibri" w:hAnsi="Calibri"/>
+      <w:rFonts w:asciiTheme="majorHAnsi" w:eastAsiaTheme="majorEastAsia" w:hAnsiTheme="majorHAnsi" w:cstheme="majorBidi"/>
       <w:color w:val="17365D" w:themeColor="text2" w:themeShade="BF"/>
       <w:spacing w:val="5"/>
       <w:kern w:val="28"/>
-      <w:sz w:val="48"/>
+      <w:sz w:val="52"/>
       <w:szCs w:val="52"/>
     </w:rPr>
   </w:style>

</xml_diff>